<commit_message>
Add 20 roles and publish cumulative 43-role workforce scenario
</commit_message>
<xml_diff>
--- a/execution-plan.docx
+++ b/execution-plan.docx
@@ -7,7 +7,7 @@
         <w:pStyle w:val="Title"/>
       </w:pPr>
       <w:r>
-        <w:t>广东江南理工教育集团 AI 人力降本 200 万目标执行方案</w:t>
+        <w:t>广东江南理工教育集团 AI 编制优化 43 岗执行方案</w:t>
       </w:r>
     </w:p>
     <w:p>
@@ -23,7 +23,7 @@
         <w:pStyle w:val="SmallText"/>
       </w:pPr>
       <w:r>
-        <w:t>决策目标：启动后首 12 个月累计减少人力成本不少于 200 万元，并同时评估扣除过渡和 AI 费用后净现金节约 200 万元的挑战目标。集团约 300 名员工、位于广州及四类业务由用户提供；校区、岗位、薪酬、合同和系统尚未核实。具体岗位与金额均为情景假设，达到目标仍需真实数据验证。</w:t>
+        <w:t>决策目标：在原首年 200 万元人力成本门槛对应的 23 岗情景上，再压减 20 岗，形成累计 43 岗压力测试。按每岗年全成本 12 万元、首年平均生效 9 个月估算，首年人力成本减少 387 万元，扣除 35 万元过渡成本和 25 万元 AI 费用后净额 327 万元，稳定年化减少 516 万元。集团约 300 名员工由用户提供；岗位、薪酬、合同和系统尚未核实。</w:t>
       </w:r>
     </w:p>
     <w:p>
@@ -36,7 +36,7 @@
     </w:p>
     <w:p>
       <w:r>
-        <w:t>董事长的首要目标是以 AI 和流程重组优化现有约 300 人编制，并兑现至少 200 万元年度人力成本节约。建议批准 15 天基线核查和 90 天受控试点，优先验证招生咨询、教务材料和行政共享流程。教师备课作为质量试点，不预先计入减编。第 90 天提交按法人、校区、岗位核准的可调整上限、分月现金流和劳动用工路径。</w:t>
+        <w:t>董事长现提出在原 23 岗门槛上追加压减 20 岗，累计压减 43 岗，期末编制情景约 257 人。建议将 43 岗列为压力测试上限，先用 15 天补齐岗位台账，再用 90 天受控试点证明容量。第 90 天提交按法人、校区、岗位核准的可调整上限、分月现金流和劳动用工路径。教师备课作为质量试点，不预先计入压减池。</w:t>
       </w:r>
     </w:p>
     <w:p>
@@ -2249,7 +2249,7 @@
     </w:p>
     <w:p>
       <w:r>
-        <w:t>测算示例：300 人每人每周节省 1.5 小时，一年按 46 周计算，释放 20,700 小时。若每年按 1,800 小时折算，约相当于 11.5 个全职岗位的工作量。这是集团总体产能示例，不能直接按 11.5 人减编：释放时间可能分散在不可合并的岗位，也可能被教学与服务底线吸收。</w:t>
+        <w:t>容量压力测试：43 岗按每岗每年 1,800 小时计算，需要 77,400 小时可合并工作量，平均摊在 300 人和 46 个工作周，相当于每人每周释放 5.61 小时。原来每人每周节省 1.5 小时的示例只释放 20,700 小时，缺口为 56,700 小时。集团必须从流程取消、共享排班和岗位合并中补足差额。</w:t>
       </w:r>
     </w:p>
     <w:p>
@@ -7470,6 +7470,11 @@
       </w:r>
     </w:p>
     <w:p>
+      <w:r>
+        <w:t>追加情景：在 23 岗首年人力成本门槛上再增加 20 岗，累计 43 岗。按同一假设，首年人力成本减少 387 万元，首年净额 327 万元，稳定年化减少 516 万元，期末编制约 257 人。43 岗占当前约 300 人的 14.3%，属于高强度组织调整。集团不得把该数字直接分配为人员名单，必须逐岗完成任务去向、服务覆盖、成本与程序核准。</w:t>
+      </w:r>
+    </w:p>
+    <w:p>
       <w:pPr>
         <w:pStyle w:val="Heading1"/>
       </w:pPr>

</xml_diff>